<commit_message>
Update for mail preview
</commit_message>
<xml_diff>
--- a/docs/mailTemplet.docx
+++ b/docs/mailTemplet.docx
@@ -4,7 +4,13 @@
   <w:body>
     <w:p>
       <w:r>
-        <w:t>HQ XXX Cmd (EME)</w:t>
+        <w:t xml:space="preserve">HQ </w:t>
+      </w:r>
+      <w:r>
+        <w:t xml:space="preserve">[Name: underline space] </w:t>
+      </w:r>
+      <w:r>
+        <w:t>Cmd (EME)</w:t>
       </w:r>
     </w:p>
     <w:p>
@@ -17,20 +23,48 @@
         <w:t>C/O 99 APO</w:t>
       </w:r>
     </w:p>
-    <w:p>
-      <w:r>
-        <w:t>0037/AE/Tech Cell dt -Feb 26, 2026</w:t>
-      </w:r>
-    </w:p>
     <w:p/>
     <w:p>
       <w:r>
-        <w:t>HQ XXX Corps(EME)</w:t>
-      </w:r>
-    </w:p>
-    <w:p>
-      <w:r>
-        <w:t>Pin YYYYY</w:t>
+        <w:t xml:space="preserve">0037/AE/Tech Cell dt </w:t>
+      </w:r>
+      <w:r>
+        <w:t xml:space="preserve">–[ Todays date, example </w:t>
+      </w:r>
+      <w:r>
+        <w:t>Feb 26, 2026</w:t>
+      </w:r>
+      <w:r>
+        <w:t>]</w:t>
+      </w:r>
+    </w:p>
+    <w:p/>
+    <w:p>
+      <w:r>
+        <w:t xml:space="preserve">HQ </w:t>
+      </w:r>
+      <w:r>
+        <w:t>[Name: underline space]</w:t>
+      </w:r>
+      <w:r>
+        <w:t xml:space="preserve"> </w:t>
+      </w:r>
+      <w:r>
+        <w:t>Corps</w:t>
+      </w:r>
+      <w:r>
+        <w:t xml:space="preserve"> </w:t>
+      </w:r>
+      <w:r>
+        <w:t>(EME)</w:t>
+      </w:r>
+    </w:p>
+    <w:p>
+      <w:r>
+        <w:t xml:space="preserve">Pin </w:t>
+      </w:r>
+      <w:r>
+        <w:t>[Name: underline space]</w:t>
       </w:r>
     </w:p>
     <w:p>
@@ -39,9 +73,38 @@
       </w:r>
     </w:p>
     <w:p>
-      <w:r>
-        <w:tab/>
-        <w:t>Anomalies in FRS (A Vehicles) for the month of Feb 2026</w:t>
+      <w:pPr>
+        <w:jc w:val="center"/>
+        <w:rPr>
+          <w:u w:val="single"/>
+        </w:rPr>
+      </w:pPr>
+      <w:r>
+        <w:rPr>
+          <w:u w:val="single"/>
+        </w:rPr>
+        <w:t>ANOMALIES IN FRS (A VEHICLES) FOR THE MONTH OF</w:t>
+      </w:r>
+      <w:r>
+        <w:rPr>
+          <w:u w:val="single"/>
+        </w:rPr>
+        <w:t xml:space="preserve"> </w:t>
+      </w:r>
+      <w:r>
+        <w:t>[current month and year, example:</w:t>
+      </w:r>
+      <w:r>
+        <w:rPr>
+          <w:u w:val="single"/>
+        </w:rPr>
+        <w:t xml:space="preserve"> FEB 2026</w:t>
+      </w:r>
+      <w:r>
+        <w:rPr>
+          <w:u w:val="single"/>
+        </w:rPr>
+        <w:t>]</w:t>
       </w:r>
     </w:p>
     <w:p>
@@ -53,7 +116,25 @@
         </w:numPr>
       </w:pPr>
       <w:r>
-        <w:t>Please refer to the FRS of your ????? for the month of Feb 2026</w:t>
+        <w:t xml:space="preserve">Please refer to the FRS of your </w:t>
+      </w:r>
+      <w:r>
+        <w:t>[Formation name]</w:t>
+      </w:r>
+      <w:r>
+        <w:t xml:space="preserve"> for the month of </w:t>
+      </w:r>
+      <w:r>
+        <w:t xml:space="preserve">[current month and year, </w:t>
+      </w:r>
+      <w:r>
+        <w:t xml:space="preserve">example: </w:t>
+      </w:r>
+      <w:r>
+        <w:t>Feb 2026</w:t>
+      </w:r>
+      <w:r>
+        <w:t>].</w:t>
       </w:r>
     </w:p>
     <w:p>
@@ -65,7 +146,10 @@
         </w:numPr>
       </w:pPr>
       <w:r>
-        <w:t>The following aspects have not been updated/mentioned incorrectly and require your attention</w:t>
+        <w:t xml:space="preserve">The following aspects have not been updated/mentioned incorrectly and require your </w:t>
+      </w:r>
+      <w:r>
+        <w:t>attention: -</w:t>
       </w:r>
     </w:p>
     <w:p>
@@ -85,7 +169,13 @@
         <w:ind w:left="1080"/>
       </w:pPr>
       <w:r>
+        <w:t>[</w:t>
+      </w:r>
+      <w:r>
         <w:t>Table</w:t>
+      </w:r>
+      <w:r>
+        <w:t xml:space="preserve"> 5]</w:t>
       </w:r>
     </w:p>
     <w:p>
@@ -105,55 +195,13 @@
         <w:ind w:left="1080"/>
       </w:pPr>
       <w:r>
+        <w:t>[</w:t>
+      </w:r>
+      <w:r>
         <w:t>Table</w:t>
       </w:r>
-    </w:p>
-    <w:p>
-      <w:pPr>
-        <w:pStyle w:val="ListParagraph"/>
-        <w:numPr>
-          <w:ilvl w:val="1"/>
-          <w:numId w:val="3"/>
-        </w:numPr>
-      </w:pPr>
-      <w:r>
-        <w:t>Other miscellaneous points</w:t>
-      </w:r>
-    </w:p>
-    <w:p>
-      <w:pPr>
-        <w:pStyle w:val="ListParagraph"/>
-        <w:numPr>
-          <w:ilvl w:val="2"/>
-          <w:numId w:val="3"/>
-        </w:numPr>
-      </w:pPr>
-      <w:r>
-        <w:t>Point 1</w:t>
-      </w:r>
-    </w:p>
-    <w:p>
-      <w:pPr>
-        <w:pStyle w:val="ListParagraph"/>
-        <w:numPr>
-          <w:ilvl w:val="2"/>
-          <w:numId w:val="3"/>
-        </w:numPr>
-      </w:pPr>
-      <w:r>
-        <w:t>Point 2</w:t>
-      </w:r>
-    </w:p>
-    <w:p>
-      <w:pPr>
-        <w:pStyle w:val="ListParagraph"/>
-        <w:numPr>
-          <w:ilvl w:val="2"/>
-          <w:numId w:val="3"/>
-        </w:numPr>
-      </w:pPr>
-      <w:r>
-        <w:t>Point 3</w:t>
+      <w:r>
+        <w:t xml:space="preserve"> 4]</w:t>
       </w:r>
     </w:p>
     <w:p>
@@ -165,7 +213,7 @@
         </w:numPr>
       </w:pPr>
       <w:r>
-        <w:t>Kindly take corrective action &amp; re-submit your FRS at the earliest. BEME is requested to speak to MGEME with respect to all  “demands not controlled” and “equipment pending for repairs for over three months”.</w:t>
+        <w:t>Kindly take corrective action &amp; re-submit your FRS at the earliest. BEME is requested to speak to MGEME with respect to all “demands not controlled” and “equipment pending for repairs for over three months”.</w:t>
       </w:r>
     </w:p>
     <w:p>
@@ -178,7 +226,19 @@
         <w:ind w:left="360"/>
       </w:pPr>
       <w:r>
-        <w:t>(xxxx)</w:t>
+        <w:t>(</w:t>
+      </w:r>
+      <w:r>
+        <w:t>[</w:t>
+      </w:r>
+      <w:r>
+        <w:t>Name: underline space</w:t>
+      </w:r>
+      <w:r>
+        <w:t>]</w:t>
+      </w:r>
+      <w:r>
+        <w:t>)</w:t>
       </w:r>
     </w:p>
     <w:p>
@@ -202,7 +262,16 @@
         <w:ind w:left="360"/>
       </w:pPr>
       <w:r>
-        <w:t>Copy to: XXX EME Brigadier – For info and necessary action please</w:t>
+        <w:t xml:space="preserve">Copy to: </w:t>
+      </w:r>
+      <w:r>
+        <w:t>[Name: underline space]</w:t>
+      </w:r>
+      <w:r>
+        <w:t xml:space="preserve"> </w:t>
+      </w:r>
+      <w:r>
+        <w:t>EME Brigadier – For info and necessary action please</w:t>
       </w:r>
       <w:r>
         <w:t>.</w:t>
@@ -311,90 +380,90 @@
   </w:abstractNum>
   <w:abstractNum w:abstractNumId="1" w15:restartNumberingAfterBreak="0">
     <w:nsid w:val="61A95AA0"/>
-    <w:multiLevelType w:val="hybridMultilevel"/>
-    <w:tmpl w:val="093484FC"/>
-    <w:lvl w:ilvl="0" w:tplc="0409000F">
+    <w:multiLevelType w:val="multilevel"/>
+    <w:tmpl w:val="4009001F"/>
+    <w:lvl w:ilvl="0">
       <w:start w:val="1"/>
       <w:numFmt w:val="decimal"/>
       <w:lvlText w:val="%1."/>
       <w:lvlJc w:val="left"/>
       <w:pPr>
-        <w:ind w:left="720" w:hanging="360"/>
+        <w:ind w:left="360" w:hanging="360"/>
       </w:pPr>
       <w:rPr>
         <w:rFonts w:hint="default"/>
       </w:rPr>
     </w:lvl>
-    <w:lvl w:ilvl="1" w:tplc="04090019">
-      <w:start w:val="1"/>
-      <w:numFmt w:val="lowerLetter"/>
-      <w:lvlText w:val="%2."/>
-      <w:lvlJc w:val="left"/>
-      <w:pPr>
-        <w:ind w:left="1440" w:hanging="360"/>
-      </w:pPr>
-    </w:lvl>
-    <w:lvl w:ilvl="2" w:tplc="0409001B">
-      <w:start w:val="1"/>
-      <w:numFmt w:val="lowerRoman"/>
-      <w:lvlText w:val="%3."/>
-      <w:lvlJc w:val="right"/>
-      <w:pPr>
-        <w:ind w:left="2160" w:hanging="180"/>
-      </w:pPr>
-    </w:lvl>
-    <w:lvl w:ilvl="3" w:tplc="0409000F" w:tentative="1">
+    <w:lvl w:ilvl="1">
       <w:start w:val="1"/>
       <w:numFmt w:val="decimal"/>
-      <w:lvlText w:val="%4."/>
-      <w:lvlJc w:val="left"/>
-      <w:pPr>
-        <w:ind w:left="2880" w:hanging="360"/>
-      </w:pPr>
-    </w:lvl>
-    <w:lvl w:ilvl="4" w:tplc="04090019" w:tentative="1">
-      <w:start w:val="1"/>
-      <w:numFmt w:val="lowerLetter"/>
-      <w:lvlText w:val="%5."/>
-      <w:lvlJc w:val="left"/>
-      <w:pPr>
-        <w:ind w:left="3600" w:hanging="360"/>
-      </w:pPr>
-    </w:lvl>
-    <w:lvl w:ilvl="5" w:tplc="0409001B" w:tentative="1">
-      <w:start w:val="1"/>
-      <w:numFmt w:val="lowerRoman"/>
-      <w:lvlText w:val="%6."/>
-      <w:lvlJc w:val="right"/>
-      <w:pPr>
-        <w:ind w:left="4320" w:hanging="180"/>
-      </w:pPr>
-    </w:lvl>
-    <w:lvl w:ilvl="6" w:tplc="0409000F" w:tentative="1">
+      <w:lvlText w:val="%1.%2."/>
+      <w:lvlJc w:val="left"/>
+      <w:pPr>
+        <w:ind w:left="792" w:hanging="432"/>
+      </w:pPr>
+    </w:lvl>
+    <w:lvl w:ilvl="2">
       <w:start w:val="1"/>
       <w:numFmt w:val="decimal"/>
-      <w:lvlText w:val="%7."/>
-      <w:lvlJc w:val="left"/>
-      <w:pPr>
-        <w:ind w:left="5040" w:hanging="360"/>
-      </w:pPr>
-    </w:lvl>
-    <w:lvl w:ilvl="7" w:tplc="04090019" w:tentative="1">
-      <w:start w:val="1"/>
-      <w:numFmt w:val="lowerLetter"/>
-      <w:lvlText w:val="%8."/>
-      <w:lvlJc w:val="left"/>
-      <w:pPr>
-        <w:ind w:left="5760" w:hanging="360"/>
-      </w:pPr>
-    </w:lvl>
-    <w:lvl w:ilvl="8" w:tplc="0409001B" w:tentative="1">
-      <w:start w:val="1"/>
-      <w:numFmt w:val="lowerRoman"/>
-      <w:lvlText w:val="%9."/>
-      <w:lvlJc w:val="right"/>
-      <w:pPr>
-        <w:ind w:left="6480" w:hanging="180"/>
+      <w:lvlText w:val="%1.%2.%3."/>
+      <w:lvlJc w:val="left"/>
+      <w:pPr>
+        <w:ind w:left="1224" w:hanging="504"/>
+      </w:pPr>
+    </w:lvl>
+    <w:lvl w:ilvl="3">
+      <w:start w:val="1"/>
+      <w:numFmt w:val="decimal"/>
+      <w:lvlText w:val="%1.%2.%3.%4."/>
+      <w:lvlJc w:val="left"/>
+      <w:pPr>
+        <w:ind w:left="1728" w:hanging="648"/>
+      </w:pPr>
+    </w:lvl>
+    <w:lvl w:ilvl="4">
+      <w:start w:val="1"/>
+      <w:numFmt w:val="decimal"/>
+      <w:lvlText w:val="%1.%2.%3.%4.%5."/>
+      <w:lvlJc w:val="left"/>
+      <w:pPr>
+        <w:ind w:left="2232" w:hanging="792"/>
+      </w:pPr>
+    </w:lvl>
+    <w:lvl w:ilvl="5">
+      <w:start w:val="1"/>
+      <w:numFmt w:val="decimal"/>
+      <w:lvlText w:val="%1.%2.%3.%4.%5.%6."/>
+      <w:lvlJc w:val="left"/>
+      <w:pPr>
+        <w:ind w:left="2736" w:hanging="936"/>
+      </w:pPr>
+    </w:lvl>
+    <w:lvl w:ilvl="6">
+      <w:start w:val="1"/>
+      <w:numFmt w:val="decimal"/>
+      <w:lvlText w:val="%1.%2.%3.%4.%5.%6.%7."/>
+      <w:lvlJc w:val="left"/>
+      <w:pPr>
+        <w:ind w:left="3240" w:hanging="1080"/>
+      </w:pPr>
+    </w:lvl>
+    <w:lvl w:ilvl="7">
+      <w:start w:val="1"/>
+      <w:numFmt w:val="decimal"/>
+      <w:lvlText w:val="%1.%2.%3.%4.%5.%6.%7.%8."/>
+      <w:lvlJc w:val="left"/>
+      <w:pPr>
+        <w:ind w:left="3744" w:hanging="1224"/>
+      </w:pPr>
+    </w:lvl>
+    <w:lvl w:ilvl="8">
+      <w:start w:val="1"/>
+      <w:numFmt w:val="decimal"/>
+      <w:lvlText w:val="%1.%2.%3.%4.%5.%6.%7.%8.%9."/>
+      <w:lvlJc w:val="left"/>
+      <w:pPr>
+        <w:ind w:left="4320" w:hanging="1440"/>
       </w:pPr>
     </w:lvl>
   </w:abstractNum>
@@ -1102,7 +1171,6 @@
   <w:style w:type="character" w:default="1" w:styleId="DefaultParagraphFont">
     <w:name w:val="Default Paragraph Font"/>
     <w:uiPriority w:val="1"/>
-    <w:semiHidden/>
     <w:unhideWhenUsed/>
   </w:style>
   <w:style w:type="table" w:default="1" w:styleId="TableNormal">

</xml_diff>